<commit_message>
Updates to Seq A report
</commit_message>
<xml_diff>
--- a/Bioinformatic-Detective_SeqA_report.docx
+++ b/Bioinformatic-Detective_SeqA_report.docx
@@ -9,50 +9,16 @@
           <w:b/>
           <w:bCs/>
           <w:color w:val="124F1A" w:themeColor="accent3" w:themeShade="BF"/>
+          <w:lang w:val="en-US"/>
         </w:rPr>
       </w:pPr>
       <w:r>
         <w:rPr>
           <w:color w:val="124F1A" w:themeColor="accent3" w:themeShade="BF"/>
-        </w:rPr>
-        <w:t>Mini-</w:t>
-      </w:r>
-      <w:proofErr w:type="gramStart"/>
-      <w:r>
-        <w:rPr>
-          <w:color w:val="124F1A" w:themeColor="accent3" w:themeShade="BF"/>
-        </w:rPr>
-        <w:t>Project:</w:t>
-      </w:r>
-      <w:proofErr w:type="gramEnd"/>
-      <w:r>
-        <w:rPr>
-          <w:color w:val="124F1A" w:themeColor="accent3" w:themeShade="BF"/>
-        </w:rPr>
-        <w:t xml:space="preserve"> The </w:t>
-      </w:r>
-      <w:proofErr w:type="spellStart"/>
-      <w:r>
-        <w:rPr>
-          <w:color w:val="124F1A" w:themeColor="accent3" w:themeShade="BF"/>
-        </w:rPr>
-        <w:t>bioinformatic</w:t>
-      </w:r>
-      <w:proofErr w:type="spellEnd"/>
-      <w:r>
-        <w:rPr>
-          <w:color w:val="124F1A" w:themeColor="accent3" w:themeShade="BF"/>
-        </w:rPr>
-        <w:t xml:space="preserve"> </w:t>
-      </w:r>
-      <w:proofErr w:type="spellStart"/>
-      <w:r>
-        <w:rPr>
-          <w:color w:val="124F1A" w:themeColor="accent3" w:themeShade="BF"/>
-        </w:rPr>
-        <w:t>detective</w:t>
-      </w:r>
-      <w:proofErr w:type="spellEnd"/>
+          <w:lang w:val="en-US"/>
+        </w:rPr>
+        <w:t>Mini-Project: The bioinformatic detective</w:t>
+      </w:r>
     </w:p>
     <w:p>
       <w:pPr>
@@ -108,13 +74,7 @@
         <w:rPr>
           <w:lang w:val="en-US"/>
         </w:rPr>
-        <w:t xml:space="preserve"> database was chosen as it has only verified sequences on it which means we are sure that the quality of the sequences is </w:t>
-      </w:r>
-      <w:r>
-        <w:rPr>
-          <w:lang w:val="en-US"/>
-        </w:rPr>
-        <w:t>good.</w:t>
+        <w:t xml:space="preserve"> database was chosen as it has only verified sequences on it which means we are sure that the quality of the sequences is good.</w:t>
       </w:r>
     </w:p>
     <w:p>
@@ -1235,16 +1195,32 @@
             <w:hideMark/>
           </w:tcPr>
           <w:p>
-            <w:pPr>
-              <w:rPr>
-                <w:lang w:val="en-US"/>
-              </w:rPr>
-            </w:pPr>
-            <w:r>
-              <w:rPr>
-                <w:lang w:val="en-US"/>
-              </w:rPr>
-              <w:t>Bacillus subtilis subsp. subtilis str. 168</w:t>
+            <w:r>
+              <w:t xml:space="preserve">Bacillus subtilis </w:t>
+            </w:r>
+            <w:proofErr w:type="spellStart"/>
+            <w:r>
+              <w:t>subsp</w:t>
+            </w:r>
+            <w:proofErr w:type="spellEnd"/>
+            <w:r>
+              <w:t xml:space="preserve">. </w:t>
+            </w:r>
+            <w:proofErr w:type="gramStart"/>
+            <w:r>
+              <w:t>subtilis</w:t>
+            </w:r>
+            <w:proofErr w:type="gramEnd"/>
+            <w:r>
+              <w:t xml:space="preserve"> </w:t>
+            </w:r>
+            <w:proofErr w:type="spellStart"/>
+            <w:r>
+              <w:t>str</w:t>
+            </w:r>
+            <w:proofErr w:type="spellEnd"/>
+            <w:r>
+              <w:t>. 168</w:t>
             </w:r>
           </w:p>
         </w:tc>
@@ -1847,13 +1823,7 @@
         <w:rPr>
           <w:lang w:val="en-US"/>
         </w:rPr>
-        <w:t xml:space="preserve">Gene and protein </w:t>
-      </w:r>
-      <w:r>
-        <w:rPr>
-          <w:lang w:val="en-US"/>
-        </w:rPr>
-        <w:t>characterization</w:t>
+        <w:t>Gene and protein characterization</w:t>
       </w:r>
     </w:p>
     <w:p>
@@ -1933,6 +1903,7 @@
       </w:pPr>
       <w:r>
         <w:rPr>
+          <w:noProof/>
           <w:lang w:val="en-US"/>
         </w:rPr>
         <w:drawing>
@@ -2023,6 +1994,72 @@
         </w:rPr>
         <w:t>Associated disease or biological relevance:</w:t>
       </w:r>
+      <w:r>
+        <w:rPr>
+          <w:lang w:val="en-US"/>
+        </w:rPr>
+        <w:t xml:space="preserve"> one of </w:t>
+      </w:r>
+      <w:r>
+        <w:rPr>
+          <w:lang w:val="en-US"/>
+        </w:rPr>
+        <w:t>the leading causes of hospital-acquired infections</w:t>
+      </w:r>
+      <w:r>
+        <w:rPr>
+          <w:lang w:val="en-US"/>
+        </w:rPr>
+        <w:t xml:space="preserve">. </w:t>
+      </w:r>
+      <w:proofErr w:type="spellStart"/>
+      <w:r>
+        <w:rPr>
+          <w:lang w:val="en-US"/>
+        </w:rPr>
+        <w:t>VanS</w:t>
+      </w:r>
+      <w:proofErr w:type="spellEnd"/>
+      <w:r>
+        <w:rPr>
+          <w:lang w:val="en-US"/>
+        </w:rPr>
+        <w:t xml:space="preserve"> can activate the </w:t>
+      </w:r>
+      <w:proofErr w:type="spellStart"/>
+      <w:r>
+        <w:rPr>
+          <w:lang w:val="en-US"/>
+        </w:rPr>
+        <w:t>VanR</w:t>
+      </w:r>
+      <w:proofErr w:type="spellEnd"/>
+      <w:r>
+        <w:rPr>
+          <w:lang w:val="en-US"/>
+        </w:rPr>
+        <w:t xml:space="preserve"> transcription factor, which then initiates transcription of the resistance </w:t>
+      </w:r>
+      <w:r>
+        <w:rPr>
+          <w:lang w:val="en-US"/>
+        </w:rPr>
+        <w:t xml:space="preserve">genes </w:t>
+      </w:r>
+      <w:proofErr w:type="spellStart"/>
+      <w:r>
+        <w:rPr>
+          <w:lang w:val="en-US"/>
+        </w:rPr>
+        <w:t>vanHAX</w:t>
+      </w:r>
+      <w:proofErr w:type="spellEnd"/>
+      <w:r>
+        <w:rPr>
+          <w:lang w:val="en-US"/>
+        </w:rPr>
+        <w:t>.</w:t>
+      </w:r>
     </w:p>
     <w:p>
       <w:pPr>
@@ -2103,13 +2140,7 @@
         <w:rPr>
           <w:lang w:val="en-US"/>
         </w:rPr>
-        <w:t>Localization</w:t>
-      </w:r>
-      <w:r>
-        <w:rPr>
-          <w:lang w:val="en-US"/>
-        </w:rPr>
-        <w:t>: Membrane protein</w:t>
+        <w:t>Localization: Membrane protein</w:t>
       </w:r>
     </w:p>
     <w:p>
@@ -2266,6 +2297,7 @@
         <w:rPr>
           <w:lang w:val="en-US"/>
         </w:rPr>
+        <w:lastRenderedPageBreak/>
         <w:t>VanR</w:t>
       </w:r>
       <w:proofErr w:type="spellEnd"/>
@@ -2276,132 +2308,115 @@
         <w:t xml:space="preserve">, when activated, acts as a transcription factor to upregulate </w:t>
       </w:r>
       <w:proofErr w:type="spellStart"/>
+      <w:r>
+        <w:rPr>
+          <w:lang w:val="en-US"/>
+        </w:rPr>
+        <w:t>vanHAX</w:t>
+      </w:r>
+      <w:proofErr w:type="spellEnd"/>
+      <w:r>
+        <w:rPr>
+          <w:lang w:val="en-US"/>
+        </w:rPr>
+        <w:t>, enabling resistance. </w:t>
+      </w:r>
+    </w:p>
+    <w:p>
+      <w:pPr>
+        <w:rPr>
+          <w:lang w:val="en-US"/>
+        </w:rPr>
+      </w:pPr>
+      <w:r>
+        <w:rPr>
+          <w:lang w:val="en-US"/>
+        </w:rPr>
+        <w:t>Functional domains: Histidine kinase (161-376 aa)</w:t>
+      </w:r>
+    </w:p>
+    <w:p>
+      <w:pPr>
+        <w:pStyle w:val="Titre1"/>
+        <w:rPr>
+          <w:b/>
+          <w:bCs/>
+          <w:lang w:val="en-US"/>
+        </w:rPr>
+      </w:pPr>
+      <w:r>
+        <w:rPr>
+          <w:lang w:val="en-US"/>
+        </w:rPr>
+        <w:t>Literature search</w:t>
+      </w:r>
+    </w:p>
+    <w:p>
+      <w:pPr>
+        <w:rPr>
+          <w:lang w:val="en-US"/>
+        </w:rPr>
+      </w:pPr>
+      <w:r>
+        <w:rPr>
+          <w:lang w:val="en-US"/>
+        </w:rPr>
+        <w:t xml:space="preserve">On the PubMed database there are 24 published papers about the Vancomycin resistance histidine kinase </w:t>
+      </w:r>
+      <w:proofErr w:type="spellStart"/>
+      <w:r>
+        <w:rPr>
+          <w:lang w:val="en-US"/>
+        </w:rPr>
+        <w:t>VanS</w:t>
+      </w:r>
+      <w:proofErr w:type="spellEnd"/>
+      <w:r>
+        <w:rPr>
+          <w:lang w:val="en-US"/>
+        </w:rPr>
+        <w:t xml:space="preserve"> gene and protein.</w:t>
+      </w:r>
+    </w:p>
+    <w:p>
+      <w:pPr>
+        <w:rPr>
+          <w:lang w:val="en-US"/>
+        </w:rPr>
+      </w:pPr>
+      <w:r>
+        <w:rPr>
+          <w:lang w:val="en-US"/>
+        </w:rPr>
+        <w:t xml:space="preserve">The paper “The </w:t>
+      </w:r>
+      <w:proofErr w:type="spellStart"/>
+      <w:r>
+        <w:rPr>
+          <w:lang w:val="en-US"/>
+        </w:rPr>
+        <w:t>VanS</w:t>
+      </w:r>
+      <w:proofErr w:type="spellEnd"/>
+      <w:r>
+        <w:rPr>
+          <w:lang w:val="en-US"/>
+        </w:rPr>
+        <w:t xml:space="preserve"> sensor histidine kinase from type-B vancomycin-resistant enterococci recognizes vancomycin directly” published in the </w:t>
+      </w:r>
       <w:r>
         <w:rPr>
           <w:i/>
           <w:iCs/>
           <w:lang w:val="en-US"/>
         </w:rPr>
-        <w:t>vanHAX</w:t>
-      </w:r>
-      <w:proofErr w:type="spellEnd"/>
-      <w:r>
-        <w:rPr>
-          <w:lang w:val="en-US"/>
-        </w:rPr>
-        <w:t>, enabling resistance. </w:t>
-      </w:r>
-    </w:p>
-    <w:p>
-      <w:pPr>
-        <w:rPr>
-          <w:lang w:val="en-US"/>
-        </w:rPr>
-      </w:pPr>
-      <w:r>
-        <w:rPr>
-          <w:lang w:val="en-US"/>
-        </w:rPr>
-        <w:t>Functional domains: Histidine kinase (161-376 aa)</w:t>
-      </w:r>
-    </w:p>
-    <w:p>
-      <w:pPr>
-        <w:pStyle w:val="Titre1"/>
-        <w:rPr>
-          <w:b/>
-          <w:bCs/>
-          <w:lang w:val="en-US"/>
-        </w:rPr>
-      </w:pPr>
-      <w:r>
-        <w:rPr>
-          <w:lang w:val="en-US"/>
-        </w:rPr>
-        <w:lastRenderedPageBreak/>
-        <w:t>Literature search</w:t>
-      </w:r>
-    </w:p>
-    <w:p>
-      <w:pPr>
-        <w:rPr>
-          <w:lang w:val="en-US"/>
-        </w:rPr>
-      </w:pPr>
-      <w:r>
-        <w:rPr>
-          <w:lang w:val="en-US"/>
-        </w:rPr>
-        <w:t xml:space="preserve">On the PubMed database there are 24 published papers about the Vancomycin resistance histidine kinase </w:t>
-      </w:r>
-      <w:proofErr w:type="spellStart"/>
-      <w:r>
-        <w:rPr>
-          <w:lang w:val="en-US"/>
-        </w:rPr>
-        <w:t>VanS</w:t>
-      </w:r>
-      <w:proofErr w:type="spellEnd"/>
-      <w:r>
-        <w:rPr>
-          <w:lang w:val="en-US"/>
-        </w:rPr>
-        <w:t xml:space="preserve"> gene and protein.</w:t>
-      </w:r>
-    </w:p>
-    <w:p>
-      <w:pPr>
-        <w:rPr>
-          <w:lang w:val="en-US"/>
-        </w:rPr>
-      </w:pPr>
-      <w:r>
-        <w:rPr>
-          <w:lang w:val="en-US"/>
-        </w:rPr>
-        <w:t xml:space="preserve">The paper “The </w:t>
-      </w:r>
-      <w:proofErr w:type="spellStart"/>
-      <w:r>
-        <w:rPr>
-          <w:lang w:val="en-US"/>
-        </w:rPr>
-        <w:t>VanS</w:t>
-      </w:r>
-      <w:proofErr w:type="spellEnd"/>
-      <w:r>
-        <w:rPr>
-          <w:lang w:val="en-US"/>
-        </w:rPr>
-        <w:t xml:space="preserve"> sensor histidine kinase from type-B vancomycin-resistant enterococci recognizes vancomycin directly” published in the </w:t>
-      </w:r>
-      <w:r>
-        <w:rPr>
-          <w:i/>
-          <w:iCs/>
-          <w:lang w:val="en-US"/>
-        </w:rPr>
-        <w:t xml:space="preserve">Journal of biological </w:t>
-      </w:r>
-      <w:r>
-        <w:rPr>
-          <w:i/>
-          <w:iCs/>
-          <w:lang w:val="en-US"/>
-        </w:rPr>
-        <w:t>chemistry</w:t>
-      </w:r>
-      <w:r>
-        <w:rPr>
-          <w:lang w:val="en-US"/>
-        </w:rPr>
-        <w:t xml:space="preserve"> in</w:t>
-      </w:r>
-      <w:r>
-        <w:rPr>
-          <w:lang w:val="en-US"/>
-        </w:rPr>
-        <w:t xml:space="preserve"> 2025 was selected for this review as it shows the importance of studying </w:t>
+        <w:t>Journal of biological chemistry</w:t>
+      </w:r>
+      <w:r>
+        <w:rPr>
+          <w:lang w:val="en-US"/>
+        </w:rPr>
+        <w:t xml:space="preserve"> in 2025 was selected for this review as it shows the importance of studying </w:t>
       </w:r>
       <w:proofErr w:type="spellStart"/>
       <w:r>
@@ -2779,6 +2794,7 @@
         <w:rPr>
           <w:lang w:val="en-US"/>
         </w:rPr>
+        <w:lastRenderedPageBreak/>
         <w:t>Homolog collection</w:t>
       </w:r>
     </w:p>
@@ -2842,7 +2858,6 @@
                 <w:b/>
                 <w:bCs/>
               </w:rPr>
-              <w:lastRenderedPageBreak/>
               <w:t>Label</w:t>
             </w:r>
           </w:p>
@@ -3613,31 +3628,7 @@
         <w:rPr>
           <w:lang w:val="en-US"/>
         </w:rPr>
-        <w:t xml:space="preserve">To do the multiple sequence alignment on the homolog collection, the program MAFFT </w:t>
-      </w:r>
-      <w:r>
-        <w:rPr>
-          <w:lang w:val="en-US"/>
-        </w:rPr>
-        <w:t>was used</w:t>
-      </w:r>
-      <w:r>
-        <w:rPr>
-          <w:lang w:val="en-US"/>
-        </w:rPr>
-        <w:t xml:space="preserve"> in the version (Galaxy Version 7.526+galaxy2). G-INS-1 was selected as the MAFFT flavor because it is progressive and creates a more accurate guide tree even though it is slower. </w:t>
-      </w:r>
-      <w:r>
-        <w:rPr>
-          <w:lang w:val="en-US"/>
-        </w:rPr>
-        <w:t>However,</w:t>
-      </w:r>
-      <w:r>
-        <w:rPr>
-          <w:lang w:val="en-US"/>
-        </w:rPr>
-        <w:t xml:space="preserve"> since we are aligning less than 200 sequences, it does not present any problems.</w:t>
+        <w:t>To do the multiple sequence alignment on the homolog collection, the program MAFFT was used in the version (Galaxy Version 7.526+galaxy2). G-INS-1 was selected as the MAFFT flavor because it is progressive and creates a more accurate guide tree even though it is slower. However, since we are aligning less than 200 sequences, it does not present any problems.</w:t>
       </w:r>
     </w:p>
     <w:p>
@@ -3747,6 +3738,10 @@
         <w:jc w:val="center"/>
       </w:pPr>
       <w:r>
+        <w:rPr>
+          <w:noProof/>
+        </w:rPr>
+        <w:lastRenderedPageBreak/>
         <w:drawing>
           <wp:inline distT="0" distB="0" distL="0" distR="0" wp14:anchorId="1F56FA4D" wp14:editId="3228715A">
             <wp:extent cx="4629150" cy="1995025"/>
@@ -3807,7 +3802,6 @@
         <w:rPr>
           <w:lang w:val="en-US"/>
         </w:rPr>
-        <w:lastRenderedPageBreak/>
         <w:t xml:space="preserve">It is the primary autophosphorylation site: the H-box contains the conserved phosphoryl-accepting histidine residue in the </w:t>
       </w:r>
       <w:proofErr w:type="spellStart"/>
@@ -3908,19 +3902,7 @@
         <w:rPr>
           <w:lang w:val="en-US"/>
         </w:rPr>
-        <w:t xml:space="preserve"> segment that immediately </w:t>
-      </w:r>
-      <w:r>
-        <w:rPr>
-          <w:lang w:val="en-US"/>
-        </w:rPr>
-        <w:t>follows</w:t>
-      </w:r>
-      <w:r>
-        <w:rPr>
-          <w:lang w:val="en-US"/>
-        </w:rPr>
-        <w:t xml:space="preserve"> the Histidine residue at </w:t>
+        <w:t xml:space="preserve"> segment that immediately follows the Histidine residue at </w:t>
       </w:r>
       <w:r>
         <w:rPr>
@@ -4041,19 +4023,7 @@
         <w:rPr>
           <w:lang w:val="en-US"/>
         </w:rPr>
-        <w:t xml:space="preserve">. This region is conserved </w:t>
-      </w:r>
-      <w:r>
-        <w:rPr>
-          <w:lang w:val="en-US"/>
-        </w:rPr>
-        <w:t>well,</w:t>
-      </w:r>
-      <w:r>
-        <w:rPr>
-          <w:lang w:val="en-US"/>
-        </w:rPr>
-        <w:t xml:space="preserve"> which underscores its important catalytic role. </w:t>
+        <w:t>. This region is conserved well, which underscores its important catalytic role. </w:t>
       </w:r>
     </w:p>
     <w:p>
@@ -4061,6 +4031,9 @@
         <w:jc w:val="center"/>
       </w:pPr>
       <w:r>
+        <w:rPr>
+          <w:noProof/>
+        </w:rPr>
         <w:drawing>
           <wp:inline distT="0" distB="0" distL="0" distR="0" wp14:anchorId="66CD28FF" wp14:editId="1C2D2789">
             <wp:extent cx="2809875" cy="1971675"/>
@@ -4278,19 +4251,7 @@
         <w:rPr>
           <w:lang w:val="en-US"/>
         </w:rPr>
-        <w:t xml:space="preserve">, that is found around 10 aa upstream of the G1-box. It plays a role in </w:t>
-      </w:r>
-      <w:r>
-        <w:rPr>
-          <w:lang w:val="en-US"/>
-        </w:rPr>
-        <w:t>conformational</w:t>
-      </w:r>
-      <w:r>
-        <w:rPr>
-          <w:lang w:val="en-US"/>
-        </w:rPr>
-        <w:t xml:space="preserve"> coupling.</w:t>
+        <w:t>, that is found around 10 aa upstream of the G1-box. It plays a role in conformational coupling.</w:t>
       </w:r>
       <w:r>
         <w:rPr>
@@ -4376,13 +4337,17 @@
         <w:rPr>
           <w:lang w:val="en-US"/>
         </w:rPr>
+        <w:lastRenderedPageBreak/>
         <w:t>The first 200 aligned residues are very variable. The beginning of the alignment is dominated by gaps and divergent sequences. </w:t>
       </w:r>
     </w:p>
     <w:p>
       <w:r>
+        <w:rPr>
+          <w:noProof/>
+        </w:rPr>
         <w:drawing>
-          <wp:inline distT="0" distB="0" distL="0" distR="0" wp14:anchorId="67AAB459" wp14:editId="3D870664">
+          <wp:inline distT="0" distB="0" distL="0" distR="0" wp14:anchorId="67AAB459" wp14:editId="21EB2655">
             <wp:extent cx="5743575" cy="904875"/>
             <wp:effectExtent l="0" t="0" r="9525" b="9525"/>
             <wp:docPr id="1418089938" name="Image 10"/>
@@ -4475,7 +4440,6 @@
         <w:rPr>
           <w:lang w:val="en-US"/>
         </w:rPr>
-        <w:lastRenderedPageBreak/>
         <w:t>VANS_ENTFC and VANSC_ENTGA have short segments that are very divergent, reflecting their plasmid-encoded vancomycin-sensing role</w:t>
       </w:r>
     </w:p>
@@ -4557,6 +4521,9 @@
     </w:p>
     <w:p>
       <w:r>
+        <w:rPr>
+          <w:noProof/>
+        </w:rPr>
         <w:drawing>
           <wp:inline distT="0" distB="0" distL="0" distR="0" wp14:anchorId="1AD5A1E3" wp14:editId="56779F7B">
             <wp:extent cx="5734050" cy="2324100"/>
@@ -4786,6 +4753,7 @@
           <w:bCs/>
           <w:lang w:val="en-US"/>
         </w:rPr>
+        <w:lastRenderedPageBreak/>
         <w:t xml:space="preserve">Cluster 2 — </w:t>
       </w:r>
       <w:proofErr w:type="spellStart"/>
@@ -4818,19 +4786,7 @@
         <w:rPr>
           <w:lang w:val="en-US"/>
         </w:rPr>
-        <w:t xml:space="preserve">The second cluster is made up </w:t>
-      </w:r>
-      <w:r>
-        <w:rPr>
-          <w:lang w:val="en-US"/>
-        </w:rPr>
-        <w:t>of VANS</w:t>
-      </w:r>
-      <w:r>
-        <w:rPr>
-          <w:lang w:val="en-US"/>
-        </w:rPr>
-        <w:t xml:space="preserve">_ENTFC and VANSC_ENTGA. They cluster together with branch lengths of 0.69 and 0.72 respectively. This also makes sense as both are vancomycin-resistance sensor kinases in </w:t>
+        <w:t xml:space="preserve">The second cluster is made up of VANS_ENTFC and VANSC_ENTGA. They cluster together with branch lengths of 0.69 and 0.72 respectively. This also makes sense as both are vancomycin-resistance sensor kinases in </w:t>
       </w:r>
       <w:r>
         <w:rPr>
@@ -4954,7 +4910,6 @@
           <w:bCs/>
           <w:lang w:val="en-US"/>
         </w:rPr>
-        <w:lastRenderedPageBreak/>
         <w:t>PhoR (</w:t>
       </w:r>
       <w:r>
@@ -5222,19 +5177,7 @@
         <w:rPr>
           <w:lang w:val="en-US"/>
         </w:rPr>
-        <w:t xml:space="preserve"> cluster together by function (vancomycin sensing</w:t>
-      </w:r>
-      <w:r>
-        <w:rPr>
-          <w:lang w:val="en-US"/>
-        </w:rPr>
-        <w:t>) and</w:t>
-      </w:r>
-      <w:r>
-        <w:rPr>
-          <w:lang w:val="en-US"/>
-        </w:rPr>
-        <w:t xml:space="preserve"> notably </w:t>
+        <w:t xml:space="preserve"> cluster together by function (vancomycin sensing) and notably </w:t>
       </w:r>
       <w:proofErr w:type="spellStart"/>
       <w:r>
@@ -5303,19 +5246,7 @@
         <w:rPr>
           <w:lang w:val="en-US"/>
         </w:rPr>
-        <w:t xml:space="preserve">), diverges because it serves a completely different sensing function (phosphate limitation instead of vancomycin). </w:t>
-      </w:r>
-      <w:r>
-        <w:rPr>
-          <w:lang w:val="en-US"/>
-        </w:rPr>
-        <w:t>Therefore,</w:t>
-      </w:r>
-      <w:r>
-        <w:rPr>
-          <w:lang w:val="en-US"/>
-        </w:rPr>
-        <w:t xml:space="preserve"> its kinase domain evolved under different selective pressures and its sequence is different.</w:t>
+        <w:t>), diverges because it serves a completely different sensing function (phosphate limitation instead of vancomycin). Therefore, its kinase domain evolved under different selective pressures and its sequence is different.</w:t>
       </w:r>
     </w:p>
     <w:p>
@@ -5332,8 +5263,11 @@
     </w:p>
     <w:p>
       <w:r>
+        <w:rPr>
+          <w:noProof/>
+        </w:rPr>
         <w:drawing>
-          <wp:inline distT="0" distB="0" distL="0" distR="0" wp14:anchorId="10B035FE" wp14:editId="11852FCA">
+          <wp:inline distT="0" distB="0" distL="0" distR="0" wp14:anchorId="10B035FE" wp14:editId="0056EDBD">
             <wp:extent cx="5734050" cy="1333500"/>
             <wp:effectExtent l="0" t="0" r="0" b="0"/>
             <wp:docPr id="1682221303" name="Image 8"/>
@@ -5432,19 +5366,8 @@
         <w:rPr>
           <w:lang w:val="en-US"/>
         </w:rPr>
-        <w:t xml:space="preserve">Step 3: run FASTTREE with ML </w:t>
-      </w:r>
-      <w:r>
-        <w:rPr>
-          <w:lang w:val="en-US"/>
-        </w:rPr>
-        <w:t>Model Jones</w:t>
-      </w:r>
-      <w:r>
-        <w:rPr>
-          <w:lang w:val="en-US"/>
-        </w:rPr>
-        <w:t>-Taylor-Thorton, CAT approximation with 20 rate categories and amino acid distances by BLOSUM45</w:t>
+        <w:lastRenderedPageBreak/>
+        <w:t>Step 3: run FASTTREE with ML Model Jones-Taylor-Thorton, CAT approximation with 20 rate categories and amino acid distances by BLOSUM45</w:t>
       </w:r>
     </w:p>
     <w:p>
@@ -5481,9 +5404,13 @@
           <w:color w:val="3A7C22" w:themeColor="accent6" w:themeShade="BF"/>
           <w:sz w:val="40"/>
           <w:szCs w:val="40"/>
-        </w:rPr>
-      </w:pPr>
-      <w:r>
+          <w:lang w:val="en-US"/>
+        </w:rPr>
+      </w:pPr>
+      <w:r>
+        <w:rPr>
+          <w:lang w:val="en-US"/>
+        </w:rPr>
         <w:br w:type="page"/>
       </w:r>
     </w:p>
@@ -5619,13 +5546,11 @@
           <w:lang w:val="en-US"/>
         </w:rPr>
       </w:pPr>
-      <w:proofErr w:type="spellStart"/>
-      <w:r>
-        <w:t>Maciunas</w:t>
-      </w:r>
-      <w:proofErr w:type="spellEnd"/>
-      <w:r>
-        <w:t xml:space="preserve">, Lina J et al. </w:t>
+      <w:r>
+        <w:rPr>
+          <w:lang w:val="en-US"/>
+        </w:rPr>
+        <w:t xml:space="preserve">Maciunas, Lina J et al. </w:t>
       </w:r>
       <w:r>
         <w:rPr>
@@ -5651,51 +5576,28 @@
         <w:rPr>
           <w:i/>
           <w:iCs/>
-        </w:rPr>
-        <w:t xml:space="preserve">The Journal of </w:t>
-      </w:r>
-      <w:proofErr w:type="spellStart"/>
-      <w:r>
-        <w:rPr>
-          <w:i/>
-          <w:iCs/>
-        </w:rPr>
-        <w:t>biological</w:t>
-      </w:r>
-      <w:proofErr w:type="spellEnd"/>
-      <w:r>
-        <w:rPr>
-          <w:i/>
-          <w:iCs/>
-        </w:rPr>
-        <w:t xml:space="preserve"> </w:t>
-      </w:r>
-      <w:proofErr w:type="spellStart"/>
-      <w:r>
-        <w:rPr>
-          <w:i/>
-          <w:iCs/>
-        </w:rPr>
-        <w:t>chemistry</w:t>
-      </w:r>
-      <w:proofErr w:type="spellEnd"/>
-      <w:r>
-        <w:t xml:space="preserve"> vol. 301,6 (2025</w:t>
+          <w:lang w:val="en-US"/>
+        </w:rPr>
+        <w:t>The Journal of biological chemistry</w:t>
+      </w:r>
+      <w:r>
+        <w:rPr>
+          <w:lang w:val="en-US"/>
+        </w:rPr>
+        <w:t xml:space="preserve"> vol. 301,6 (2025): 110276. </w:t>
       </w:r>
       <w:proofErr w:type="gramStart"/>
       <w:r>
-        <w:t>):</w:t>
+        <w:rPr>
+          <w:lang w:val="en-US"/>
+        </w:rPr>
+        <w:t>doi:10.1016/j.jbc</w:t>
       </w:r>
       <w:proofErr w:type="gramEnd"/>
       <w:r>
-        <w:t xml:space="preserve"> 110276. </w:t>
-      </w:r>
-      <w:proofErr w:type="gramStart"/>
-      <w:r>
-        <w:t>doi:10.1016/j.jbc</w:t>
-      </w:r>
-      <w:proofErr w:type="gramEnd"/>
-      <w:r>
+        <w:rPr>
+          <w:lang w:val="en-US"/>
+        </w:rPr>
         <w:t>.2025.110276</w:t>
       </w:r>
     </w:p>
@@ -7086,6 +6988,7 @@
   <w:style w:type="character" w:default="1" w:styleId="Policepardfaut">
     <w:name w:val="Default Paragraph Font"/>
     <w:uiPriority w:val="1"/>
+    <w:semiHidden/>
     <w:unhideWhenUsed/>
   </w:style>
   <w:style w:type="table" w:default="1" w:styleId="TableauNormal">

</xml_diff>